<commit_message>
Add productivity-focused Chief of Staff artifacts
</commit_message>
<xml_diff>
--- a/agent-outputs/hypothetical-local-agent-suite/doe-runs/deckDepth-high-docDepth-high-dashboardDepth-high/chief-of-staff-agent/weekly-ops/operating-plan.docx
+++ b/agent-outputs/hypothetical-local-agent-suite/doe-runs/deckDepth-high-docDepth-high-dashboardDepth-high/chief-of-staff-agent/weekly-ops/operating-plan.docx
@@ -119,23 +119,7 @@
         <w:pStyle w:val="ListParagraph"/>
       </w:pPr>
       <w:r>
-        <w:t>qwen3:8b-q4_K_M: A security or quality control measure for local agents generating files in a sandbox is implementing strict input validation and output sanitization to prevent malicious or malformed file creation.</w:t>
-      </w:r>
-    </w:p>
-    <w:p>
-      <w:pPr>
-        <w:pStyle w:val="ListParagraph"/>
-      </w:pPr>
-      <w:r>
-        <w:t>gemma4:26b: Implement automated file integrity monitoring and malware scanning within the sandbox to detect unauthorized modifications or malicious payloads before they exit the isolated environment.</w:t>
-      </w:r>
-    </w:p>
-    <w:p>
-      <w:pPr>
-        <w:pStyle w:val="ListParagraph"/>
-      </w:pPr>
-      <w:r>
-        <w:t>tinyllama:latest: Satisfactory Agent for Local Agents Generating Files in Sandbox</w:t>
+        <w:t>Model calls skipped for deterministic test run</w:t>
       </w:r>
     </w:p>
     <w:sectPr>
@@ -162,6 +146,14 @@
       <w:sz w:val="28"/>
     </w:rPr>
   </w:style>
+  <w:style w:type="paragraph" w:styleId="Heading2">
+    <w:name w:val="Heading 2"/>
+    <w:rPr>
+      <w:b/>
+      <w:sz w:val="22"/>
+      <w:color w:val="2563EB"/>
+    </w:rPr>
+  </w:style>
   <w:style w:type="paragraph" w:styleId="ListParagraph">
     <w:name w:val="List Paragraph"/>
   </w:style>

</xml_diff>